<commit_message>
Sincronización de repositorio local y remoto con material actualizado
</commit_message>
<xml_diff>
--- a/Melany - IAFO/Inglés/inglés Melany - 23 de Abril 2026.docx
+++ b/Melany - IAFO/Inglés/inglés Melany - 23 de Abril 2026.docx
@@ -12,6 +12,9 @@
     </w:p>
     <w:p>
       <w:r>
+        <w:rPr>
+          <w:noProof/>
+        </w:rPr>
         <w:drawing>
           <wp:anchor distT="0" distB="0" distL="114300" distR="114300" simplePos="0" relativeHeight="251658240" behindDoc="0" locked="0" layoutInCell="1" allowOverlap="1" wp14:anchorId="33C2CB8C" wp14:editId="78A444F3">
             <wp:simplePos x="0" y="0"/>
@@ -83,6 +86,9 @@
     </w:p>
     <w:p>
       <w:r>
+        <w:rPr>
+          <w:noProof/>
+        </w:rPr>
         <w:lastRenderedPageBreak/>
         <w:drawing>
           <wp:anchor distT="0" distB="0" distL="114300" distR="114300" simplePos="0" relativeHeight="251660288" behindDoc="0" locked="0" layoutInCell="1" allowOverlap="1" wp14:anchorId="4E37612E" wp14:editId="35F44B9F">
@@ -153,18 +159,21 @@
         <w:br w:type="page"/>
       </w:r>
       <w:r>
+        <w:rPr>
+          <w:noProof/>
+        </w:rPr>
         <w:lastRenderedPageBreak/>
         <w:drawing>
-          <wp:anchor distT="0" distB="0" distL="114300" distR="114300" simplePos="0" relativeHeight="251662336" behindDoc="0" locked="0" layoutInCell="1" allowOverlap="1" wp14:anchorId="15D96F2F" wp14:editId="2A5ACADB">
+          <wp:anchor distT="0" distB="0" distL="114300" distR="114300" simplePos="0" relativeHeight="251662336" behindDoc="0" locked="0" layoutInCell="1" allowOverlap="1" wp14:anchorId="15D96F2F" wp14:editId="4E590897">
             <wp:simplePos x="0" y="0"/>
             <wp:positionH relativeFrom="margin">
-              <wp:align>right</wp:align>
+              <wp:posOffset>-1877695</wp:posOffset>
             </wp:positionH>
             <wp:positionV relativeFrom="paragraph">
-              <wp:posOffset>1790700</wp:posOffset>
+              <wp:posOffset>1885950</wp:posOffset>
             </wp:positionV>
-            <wp:extent cx="10405110" cy="6824345"/>
-            <wp:effectExtent l="0" t="318" r="0" b="0"/>
+            <wp:extent cx="10520045" cy="6766560"/>
+            <wp:effectExtent l="0" t="9207" r="5397" b="5398"/>
             <wp:wrapSquare wrapText="bothSides"/>
             <wp:docPr id="631486381" name="Imagen 1"/>
             <wp:cNvGraphicFramePr>
@@ -185,7 +194,7 @@
                         </a:ext>
                       </a:extLst>
                     </a:blip>
-                    <a:srcRect l="13539" t="71320" r="9729" b="2690"/>
+                    <a:srcRect l="12806" t="71539" r="9610" b="2690"/>
                     <a:stretch>
                       <a:fillRect/>
                     </a:stretch>
@@ -193,7 +202,7 @@
                   <pic:spPr bwMode="auto">
                     <a:xfrm rot="5400000">
                       <a:off x="0" y="0"/>
-                      <a:ext cx="10405110" cy="6824345"/>
+                      <a:ext cx="10520045" cy="6766560"/>
                     </a:xfrm>
                     <a:prstGeom prst="rect">
                       <a:avLst/>

</xml_diff>